<commit_message>
Add real PivotCharts (Q10, Q11) and an Item slicer on Q11
Q11 now has its own copy of the Q10 pivot with a pie PivotChart and an
Item slicer, written in Excel's own XML structure (modelled on the Excel
PivotChart and slicer in the supplied answer workbook), so the Q10
answer stays unfiltered. Core parts are validated against the ISO
29500 schemas (validator calibrated on the Excel-made file), values
re-verified, and the write-up updated.

Co-Authored-By: Claude Opus 5.5 <noreply@anthropic.com>
Claude-Session: https://claude.ai/code/session_01X2T5i2f9gjLf4SVrhoL3Gk
</commit_message>
<xml_diff>
--- a/assignments/sheet/output/Pivot_Table_Assignment_Answers.docx
+++ b/assignments/sheet/output/Pivot_Table_Assignment_Answers.docx
@@ -7526,7 +7526,7 @@
         <w:t xml:space="preserve"> </w:t>
       </w:r>
       <w:r>
-        <w:t xml:space="preserve">in Values, plotted as a pie chart (</w:t>
+        <w:t xml:space="preserve">in Values. The pie is a PivotChart built on this pivot (</w:t>
       </w:r>
       <w:r>
         <w:rPr>
@@ -7536,7 +7536,7 @@
         <w:t xml:space="preserve">PivotTable Analyze → PivotChart → Pie</w:t>
       </w:r>
       <w:r>
-        <w:t xml:space="preserve">).</w:t>
+        <w:t xml:space="preserve">), so it redraws whenever the pivot changes.</w:t>
       </w:r>
     </w:p>
     <w:tbl>
@@ -7954,7 +7954,7 @@
       <w:r>
         <w:drawing>
           <wp:inline>
-            <wp:extent cx="3840480" cy="2596380"/>
+            <wp:extent cx="3840480" cy="3391911"/>
             <wp:effectExtent b="0" l="0" r="0" t="0"/>
             <wp:docPr descr="Pie chart of sales per store in the USA" title="" id="30" name="Picture"/>
             <a:graphic>
@@ -7975,7 +7975,7 @@
                   <pic:spPr bwMode="auto">
                     <a:xfrm>
                       <a:off x="0" y="0"/>
-                      <a:ext cx="3840480" cy="2596380"/>
+                      <a:ext cx="3840480" cy="3391911"/>
                     </a:xfrm>
                     <a:prstGeom prst="rect">
                       <a:avLst/>
@@ -8025,7 +8025,23 @@
         <w:pStyle w:val="FirstParagraph"/>
       </w:pPr>
       <w:r>
-        <w:t xml:space="preserve">Click inside the Q10 pivot table, go to</w:t>
+        <w:t xml:space="preserve">The Q11 tab repeats the Q10 pivot table with its own pie PivotChart, so the Q10 answer stays unfiltered. A slicer on</w:t>
+      </w:r>
+      <w:r>
+        <w:t xml:space="preserve"> </w:t>
+      </w:r>
+      <w:r>
+        <w:rPr>
+          <w:bCs/>
+          <w:b/>
+        </w:rPr>
+        <w:t xml:space="preserve">Item</w:t>
+      </w:r>
+      <w:r>
+        <w:t xml:space="preserve"> </w:t>
+      </w:r>
+      <w:r>
+        <w:t xml:space="preserve">was added to it (click inside the pivot,</w:t>
       </w:r>
       <w:r>
         <w:t xml:space="preserve"> </w:t>
@@ -8051,10 +8067,7 @@
         <w:t xml:space="preserve">Item</w:t>
       </w:r>
       <w:r>
-        <w:t xml:space="preserve"> </w:t>
-      </w:r>
-      <w:r>
-        <w:t xml:space="preserve">and click</w:t>
+        <w:t xml:space="preserve">,</w:t>
       </w:r>
       <w:r>
         <w:t xml:space="preserve"> </w:t>
@@ -8067,10 +8080,7 @@
         <w:t xml:space="preserve">OK</w:t>
       </w:r>
       <w:r>
-        <w:t xml:space="preserve"> </w:t>
-      </w:r>
-      <w:r>
-        <w:t xml:space="preserve">(Microsoft, n.d.-c). The slicer is connected to the pivot table, and the PivotChart is built on that pivot table. So clicking an item in the slicer, for example</w:t>
+        <w:t xml:space="preserve">; Microsoft, n.d.-c). The slicer is connected to the pivot table, and the PivotChart is built on that pivot table. So clicking an item in the slicer, for example</w:t>
       </w:r>
       <w:r>
         <w:t xml:space="preserve"> </w:t>

</xml_diff>